<commit_message>
added final esey documentation of project
</commit_message>
<xml_diff>
--- a/Esey/PREDLOZAK KV3.docx
+++ b/Esey/PREDLOZAK KV3.docx
@@ -959,88 +959,6 @@
       <w:proofErr w:type="spellEnd"/>
       <w:r>
         <w:t>:</w:t>
-      </w:r>
-    </w:p>
-    <w:p>
-      <w:pPr>
-        <w:pStyle w:val="ListParagraph"/>
-        <w:numPr>
-          <w:ilvl w:val="0"/>
-          <w:numId w:val="2"/>
-        </w:numPr>
-        <w:ind w:left="1080"/>
-      </w:pPr>
-      <w:proofErr w:type="spellStart"/>
-      <w:r>
-        <w:t>Interakcija</w:t>
-      </w:r>
-      <w:proofErr w:type="spellEnd"/>
-      <w:r>
-        <w:t xml:space="preserve"> </w:t>
-      </w:r>
-      <w:proofErr w:type="spellStart"/>
-      <w:r>
-        <w:t>među</w:t>
-      </w:r>
-      <w:proofErr w:type="spellEnd"/>
-      <w:r>
-        <w:t xml:space="preserve"> </w:t>
-      </w:r>
-      <w:proofErr w:type="spellStart"/>
-      <w:r>
-        <w:t>grafovima</w:t>
-      </w:r>
-      <w:proofErr w:type="spellEnd"/>
-      <w:r>
-        <w:t xml:space="preserve"> (</w:t>
-      </w:r>
-      <w:proofErr w:type="spellStart"/>
-      <w:r>
-        <w:t>klik</w:t>
-      </w:r>
-      <w:proofErr w:type="spellEnd"/>
-      <w:r>
-        <w:t xml:space="preserve"> </w:t>
-      </w:r>
-      <w:proofErr w:type="spellStart"/>
-      <w:r>
-        <w:t>na</w:t>
-      </w:r>
-      <w:proofErr w:type="spellEnd"/>
-      <w:r>
-        <w:t xml:space="preserve"> </w:t>
-      </w:r>
-      <w:proofErr w:type="spellStart"/>
-      <w:r>
-        <w:t>zemlju</w:t>
-      </w:r>
-      <w:proofErr w:type="spellEnd"/>
-      <w:r>
-        <w:t xml:space="preserve"> -&gt; </w:t>
-      </w:r>
-      <w:proofErr w:type="spellStart"/>
-      <w:r>
-        <w:t>svi</w:t>
-      </w:r>
-      <w:proofErr w:type="spellEnd"/>
-      <w:r>
-        <w:t xml:space="preserve"> </w:t>
-      </w:r>
-      <w:proofErr w:type="spellStart"/>
-      <w:r>
-        <w:t>prikazi</w:t>
-      </w:r>
-      <w:proofErr w:type="spellEnd"/>
-      <w:r>
-        <w:t xml:space="preserve"> se </w:t>
-      </w:r>
-      <w:proofErr w:type="spellStart"/>
-      <w:r>
-        <w:t>ažuriraju</w:t>
-      </w:r>
-      <w:proofErr w:type="spellEnd"/>
-      <w:r>
-        <w:t>)</w:t>
       </w:r>
     </w:p>
     <w:p>
@@ -1172,6 +1090,7 @@
     <w:p/>
     <w:p/>
     <w:p/>
+    <w:p/>
     <w:p>
       <w:pPr>
         <w:pStyle w:val="Heading2"/>
@@ -1223,6 +1142,97 @@
       </w:r>
       <w:proofErr w:type="spellEnd"/>
     </w:p>
+    <w:p/>
+    <w:p>
+      <w:pPr>
+        <w:rPr>
+          <w:b/>
+          <w:bCs/>
+        </w:rPr>
+      </w:pPr>
+      <w:bookmarkStart w:id="3" w:name="_Hlk200975727"/>
+      <w:proofErr w:type="spellStart"/>
+      <w:r>
+        <w:rPr>
+          <w:b/>
+          <w:bCs/>
+        </w:rPr>
+        <w:lastRenderedPageBreak/>
+        <w:t>Prikaz</w:t>
+      </w:r>
+      <w:proofErr w:type="spellEnd"/>
+      <w:r>
+        <w:rPr>
+          <w:b/>
+          <w:bCs/>
+        </w:rPr>
+        <w:t xml:space="preserve"> </w:t>
+      </w:r>
+      <w:proofErr w:type="spellStart"/>
+      <w:r>
+        <w:rPr>
+          <w:b/>
+          <w:bCs/>
+        </w:rPr>
+        <w:t>medalja</w:t>
+      </w:r>
+      <w:proofErr w:type="spellEnd"/>
+      <w:r>
+        <w:rPr>
+          <w:b/>
+          <w:bCs/>
+        </w:rPr>
+        <w:t xml:space="preserve"> po </w:t>
+      </w:r>
+      <w:proofErr w:type="spellStart"/>
+      <w:r>
+        <w:rPr>
+          <w:b/>
+          <w:bCs/>
+        </w:rPr>
+        <w:t>državama</w:t>
+      </w:r>
+      <w:proofErr w:type="spellEnd"/>
+      <w:r>
+        <w:rPr>
+          <w:b/>
+          <w:bCs/>
+        </w:rPr>
+        <w:t xml:space="preserve"> </w:t>
+      </w:r>
+      <w:proofErr w:type="spellStart"/>
+      <w:r>
+        <w:rPr>
+          <w:b/>
+          <w:bCs/>
+        </w:rPr>
+        <w:t>kroz</w:t>
+      </w:r>
+      <w:proofErr w:type="spellEnd"/>
+      <w:r>
+        <w:rPr>
+          <w:b/>
+          <w:bCs/>
+        </w:rPr>
+        <w:t xml:space="preserve"> </w:t>
+      </w:r>
+      <w:proofErr w:type="spellStart"/>
+      <w:r>
+        <w:rPr>
+          <w:b/>
+          <w:bCs/>
+        </w:rPr>
+        <w:t>godine</w:t>
+      </w:r>
+      <w:proofErr w:type="spellEnd"/>
+      <w:r>
+        <w:rPr>
+          <w:b/>
+          <w:bCs/>
+        </w:rPr>
+        <w:t xml:space="preserve"> (bar chart)</w:t>
+      </w:r>
+    </w:p>
     <w:p>
       <w:proofErr w:type="spellStart"/>
       <w:r>
@@ -1544,7 +1554,7 @@
           <w:noProof/>
         </w:rPr>
         <w:drawing>
-          <wp:inline distT="0" distB="0" distL="0" distR="0" wp14:anchorId="5EFED48E" wp14:editId="44BD2721">
+          <wp:inline distT="0" distB="0" distL="0" distR="0" wp14:anchorId="5EFED48E" wp14:editId="13E6F98B">
             <wp:extent cx="5001630" cy="6644640"/>
             <wp:effectExtent l="0" t="0" r="8890" b="3810"/>
             <wp:docPr id="927413181" name="Picture 1" descr="A screen shot of a computer program&#10;&#10;AI-generated content may be incorrect."/>
@@ -1567,7 +1577,7 @@
                   <pic:spPr>
                     <a:xfrm>
                       <a:off x="0" y="0"/>
-                      <a:ext cx="5025681" cy="6676591"/>
+                      <a:ext cx="5001630" cy="6644640"/>
                     </a:xfrm>
                     <a:prstGeom prst="rect">
                       <a:avLst/>
@@ -1638,6 +1648,7 @@
         <w:rPr>
           <w:noProof/>
         </w:rPr>
+        <w:lastRenderedPageBreak/>
         <w:drawing>
           <wp:inline distT="0" distB="0" distL="0" distR="0" wp14:anchorId="2CF6336C" wp14:editId="7683B535">
             <wp:extent cx="4979003" cy="8023860"/>
@@ -1743,6 +1754,7 @@
         <w:rPr>
           <w:noProof/>
         </w:rPr>
+        <w:lastRenderedPageBreak/>
         <w:drawing>
           <wp:inline distT="0" distB="0" distL="0" distR="0" wp14:anchorId="2349E690" wp14:editId="24B65F76">
             <wp:extent cx="5110576" cy="3810000"/>
@@ -1920,7 +1932,86 @@
     </w:p>
     <w:p>
       <w:pPr>
-        <w:ind w:left="720"/>
+        <w:jc w:val="both"/>
+      </w:pPr>
+    </w:p>
+    <w:p>
+      <w:pPr>
+        <w:jc w:val="both"/>
+        <w:rPr>
+          <w:b/>
+          <w:bCs/>
+        </w:rPr>
+      </w:pPr>
+      <w:proofErr w:type="spellStart"/>
+      <w:r>
+        <w:rPr>
+          <w:b/>
+          <w:bCs/>
+        </w:rPr>
+        <w:lastRenderedPageBreak/>
+        <w:t>Prikaz</w:t>
+      </w:r>
+      <w:proofErr w:type="spellEnd"/>
+      <w:r>
+        <w:rPr>
+          <w:b/>
+          <w:bCs/>
+        </w:rPr>
+        <w:t xml:space="preserve"> </w:t>
+      </w:r>
+      <w:proofErr w:type="spellStart"/>
+      <w:r>
+        <w:rPr>
+          <w:b/>
+          <w:bCs/>
+        </w:rPr>
+        <w:t>broja</w:t>
+      </w:r>
+      <w:proofErr w:type="spellEnd"/>
+      <w:r>
+        <w:rPr>
+          <w:b/>
+          <w:bCs/>
+        </w:rPr>
+        <w:t xml:space="preserve"> </w:t>
+      </w:r>
+      <w:proofErr w:type="spellStart"/>
+      <w:r>
+        <w:rPr>
+          <w:b/>
+          <w:bCs/>
+        </w:rPr>
+        <w:t>sportaša</w:t>
+      </w:r>
+      <w:proofErr w:type="spellEnd"/>
+      <w:r>
+        <w:rPr>
+          <w:b/>
+          <w:bCs/>
+        </w:rPr>
+        <w:t xml:space="preserve"> po </w:t>
+      </w:r>
+      <w:proofErr w:type="spellStart"/>
+      <w:r>
+        <w:rPr>
+          <w:b/>
+          <w:bCs/>
+        </w:rPr>
+        <w:t>spolu</w:t>
+      </w:r>
+      <w:proofErr w:type="spellEnd"/>
+      <w:r>
+        <w:rPr>
+          <w:b/>
+          <w:bCs/>
+        </w:rPr>
+        <w:t xml:space="preserve"> (pie chart)</w:t>
+      </w:r>
+    </w:p>
+    <w:p>
+      <w:pPr>
+        <w:jc w:val="both"/>
       </w:pPr>
       <w:proofErr w:type="spellStart"/>
       <w:r>
@@ -2182,6 +2273,7 @@
           <w:b/>
           <w:bCs/>
         </w:rPr>
+        <w:lastRenderedPageBreak/>
         <w:t>Slika 4.</w:t>
       </w:r>
       <w:r>
@@ -2282,6 +2374,7 @@
           <w:b/>
           <w:bCs/>
         </w:rPr>
+        <w:lastRenderedPageBreak/>
         <w:t>Slika 5.</w:t>
       </w:r>
       <w:r>
@@ -2490,13 +2583,78 @@
     </w:p>
     <w:p>
       <w:pPr>
-        <w:ind w:left="720"/>
-      </w:pPr>
-    </w:p>
-    <w:p>
-      <w:pPr>
-        <w:ind w:left="720"/>
-      </w:pPr>
+        <w:rPr>
+          <w:b/>
+          <w:bCs/>
+        </w:rPr>
+      </w:pPr>
+      <w:proofErr w:type="spellStart"/>
+      <w:r>
+        <w:rPr>
+          <w:b/>
+          <w:bCs/>
+        </w:rPr>
+        <w:lastRenderedPageBreak/>
+        <w:t>Interaktivna</w:t>
+      </w:r>
+      <w:proofErr w:type="spellEnd"/>
+      <w:r>
+        <w:rPr>
+          <w:b/>
+          <w:bCs/>
+        </w:rPr>
+        <w:t xml:space="preserve"> </w:t>
+      </w:r>
+      <w:proofErr w:type="spellStart"/>
+      <w:r>
+        <w:rPr>
+          <w:b/>
+          <w:bCs/>
+        </w:rPr>
+        <w:t>karta</w:t>
+      </w:r>
+      <w:proofErr w:type="spellEnd"/>
+      <w:r>
+        <w:rPr>
+          <w:b/>
+          <w:bCs/>
+        </w:rPr>
+        <w:t xml:space="preserve"> </w:t>
+      </w:r>
+      <w:proofErr w:type="spellStart"/>
+      <w:r>
+        <w:rPr>
+          <w:b/>
+          <w:bCs/>
+        </w:rPr>
+        <w:t>svijeta</w:t>
+      </w:r>
+      <w:proofErr w:type="spellEnd"/>
+      <w:r>
+        <w:rPr>
+          <w:b/>
+          <w:bCs/>
+        </w:rPr>
+        <w:t xml:space="preserve"> (choropleth </w:t>
+      </w:r>
+      <w:proofErr w:type="spellStart"/>
+      <w:r>
+        <w:rPr>
+          <w:b/>
+          <w:bCs/>
+        </w:rPr>
+        <w:t>mapa</w:t>
+      </w:r>
+      <w:proofErr w:type="spellEnd"/>
+      <w:r>
+        <w:rPr>
+          <w:b/>
+          <w:bCs/>
+        </w:rPr>
+        <w:t>)</w:t>
+      </w:r>
+    </w:p>
+    <w:p>
       <w:r>
         <w:t xml:space="preserve">Na </w:t>
       </w:r>
@@ -2719,9 +2877,9 @@
           <w:noProof/>
         </w:rPr>
         <w:drawing>
-          <wp:inline distT="0" distB="0" distL="0" distR="0" wp14:anchorId="0374A545" wp14:editId="4533115B">
-            <wp:extent cx="4206240" cy="7139866"/>
-            <wp:effectExtent l="0" t="0" r="3810" b="4445"/>
+          <wp:inline distT="0" distB="0" distL="0" distR="0" wp14:anchorId="0374A545" wp14:editId="54868A00">
+            <wp:extent cx="3868785" cy="6567055"/>
+            <wp:effectExtent l="0" t="0" r="0" b="5715"/>
             <wp:docPr id="1526074974" name="Picture 1" descr="A screen shot of a computer program&#10;&#10;AI-generated content may be incorrect."/>
             <wp:cNvGraphicFramePr>
               <a:graphicFrameLocks xmlns:a="http://schemas.openxmlformats.org/drawingml/2006/main" noChangeAspect="1"/>
@@ -2742,7 +2900,7 @@
                   <pic:spPr>
                     <a:xfrm>
                       <a:off x="0" y="0"/>
-                      <a:ext cx="4209160" cy="7144823"/>
+                      <a:ext cx="3886085" cy="6596420"/>
                     </a:xfrm>
                     <a:prstGeom prst="rect">
                       <a:avLst/>
@@ -2816,6 +2974,7 @@
         <w:rPr>
           <w:noProof/>
         </w:rPr>
+        <w:lastRenderedPageBreak/>
         <w:drawing>
           <wp:inline distT="0" distB="0" distL="0" distR="0" wp14:anchorId="68F9952F" wp14:editId="2E6A8CB9">
             <wp:extent cx="5332082" cy="5036820"/>
@@ -2933,6 +3092,7 @@
         <w:rPr>
           <w:noProof/>
         </w:rPr>
+        <w:lastRenderedPageBreak/>
         <w:drawing>
           <wp:inline distT="0" distB="0" distL="0" distR="0" wp14:anchorId="044ADACD" wp14:editId="1D5621EB">
             <wp:extent cx="4976287" cy="3528060"/>
@@ -2991,15 +3151,7 @@
       </w:r>
       <w:proofErr w:type="spellEnd"/>
       <w:r>
-        <w:t xml:space="preserve"> interaktivne </w:t>
-      </w:r>
-      <w:proofErr w:type="spellStart"/>
-      <w:r>
-        <w:t>karte</w:t>
-      </w:r>
-      <w:proofErr w:type="spellEnd"/>
-      <w:r>
-        <w:t xml:space="preserve"> </w:t>
+        <w:t xml:space="preserve"> interaktivne karte </w:t>
       </w:r>
       <w:proofErr w:type="spellStart"/>
       <w:r>
@@ -3145,10 +3297,81 @@
         <w:jc w:val="center"/>
       </w:pPr>
     </w:p>
-    <w:p>
-      <w:pPr>
-        <w:ind w:left="720"/>
-      </w:pPr>
+    <w:p/>
+    <w:p>
+      <w:pPr>
+        <w:rPr>
+          <w:b/>
+          <w:bCs/>
+        </w:rPr>
+      </w:pPr>
+      <w:proofErr w:type="spellStart"/>
+      <w:r>
+        <w:rPr>
+          <w:b/>
+          <w:bCs/>
+        </w:rPr>
+        <w:lastRenderedPageBreak/>
+        <w:t>Vizualizacija</w:t>
+      </w:r>
+      <w:proofErr w:type="spellEnd"/>
+      <w:r>
+        <w:rPr>
+          <w:b/>
+          <w:bCs/>
+        </w:rPr>
+        <w:t xml:space="preserve"> </w:t>
+      </w:r>
+      <w:proofErr w:type="spellStart"/>
+      <w:r>
+        <w:rPr>
+          <w:b/>
+          <w:bCs/>
+        </w:rPr>
+        <w:t>promjena</w:t>
+      </w:r>
+      <w:proofErr w:type="spellEnd"/>
+      <w:r>
+        <w:rPr>
+          <w:b/>
+          <w:bCs/>
+        </w:rPr>
+        <w:t xml:space="preserve"> po </w:t>
+      </w:r>
+      <w:proofErr w:type="spellStart"/>
+      <w:r>
+        <w:rPr>
+          <w:b/>
+          <w:bCs/>
+        </w:rPr>
+        <w:t>godinama</w:t>
+      </w:r>
+      <w:proofErr w:type="spellEnd"/>
+      <w:r>
+        <w:rPr>
+          <w:b/>
+          <w:bCs/>
+        </w:rPr>
+        <w:t xml:space="preserve"> (line chart s </w:t>
+      </w:r>
+      <w:proofErr w:type="spellStart"/>
+      <w:r>
+        <w:rPr>
+          <w:b/>
+          <w:bCs/>
+        </w:rPr>
+        <w:t>animacijom</w:t>
+      </w:r>
+      <w:proofErr w:type="spellEnd"/>
+      <w:r>
+        <w:rPr>
+          <w:b/>
+          <w:bCs/>
+        </w:rPr>
+        <w:t>)</w:t>
+      </w:r>
+    </w:p>
+    <w:p>
       <w:proofErr w:type="spellStart"/>
       <w:r>
         <w:t>Korisnik</w:t>
@@ -3468,6 +3691,7 @@
           <w:b/>
           <w:bCs/>
         </w:rPr>
+        <w:lastRenderedPageBreak/>
         <w:t>Slika 10.</w:t>
       </w:r>
       <w:r>
@@ -3691,8 +3915,8 @@
         </w:rPr>
         <w:t>S</w:t>
       </w:r>
-      <w:bookmarkStart w:id="3" w:name="_itz19pnh67g0"/>
-      <w:bookmarkEnd w:id="3"/>
+      <w:bookmarkStart w:id="4" w:name="_itz19pnh67g0"/>
+      <w:bookmarkEnd w:id="4"/>
       <w:r>
         <w:rPr>
           <w:b/>
@@ -3744,6 +3968,7 @@
         <w:t xml:space="preserve"> 11</w:t>
       </w:r>
     </w:p>
+    <w:bookmarkEnd w:id="3"/>
     <w:p>
       <w:pPr>
         <w:ind w:left="720"/>
@@ -3767,7 +3992,6 @@
         <w:rPr>
           <w:rFonts w:eastAsia="Arial"/>
         </w:rPr>
-        <w:lastRenderedPageBreak/>
         <w:t>Implementacija</w:t>
       </w:r>
       <w:proofErr w:type="spellEnd"/>
@@ -3803,6 +4027,60 @@
     <w:p>
       <w:pPr>
         <w:spacing w:before="240" w:after="140"/>
+        <w:rPr>
+          <w:b/>
+          <w:bCs/>
+        </w:rPr>
+      </w:pPr>
+      <w:bookmarkStart w:id="5" w:name="_Hlk200975889"/>
+      <w:bookmarkStart w:id="6" w:name="_Hlk200975980"/>
+      <w:r>
+        <w:rPr>
+          <w:b/>
+          <w:bCs/>
+        </w:rPr>
+        <w:t xml:space="preserve">Hover </w:t>
+      </w:r>
+      <w:proofErr w:type="spellStart"/>
+      <w:r>
+        <w:rPr>
+          <w:b/>
+          <w:bCs/>
+        </w:rPr>
+        <w:t>prikaz</w:t>
+      </w:r>
+      <w:proofErr w:type="spellEnd"/>
+      <w:r>
+        <w:rPr>
+          <w:b/>
+          <w:bCs/>
+        </w:rPr>
+        <w:t xml:space="preserve"> </w:t>
+      </w:r>
+      <w:proofErr w:type="spellStart"/>
+      <w:r>
+        <w:rPr>
+          <w:b/>
+          <w:bCs/>
+        </w:rPr>
+        <w:t>informacija</w:t>
+      </w:r>
+      <w:proofErr w:type="spellEnd"/>
+      <w:r>
+        <w:rPr>
+          <w:b/>
+          <w:bCs/>
+        </w:rPr>
+        <w:t xml:space="preserve"> (tooltip)</w:t>
+      </w:r>
+    </w:p>
+    <w:p>
+      <w:pPr>
+        <w:spacing w:before="240" w:after="140"/>
+        <w:rPr>
+          <w:b/>
+          <w:bCs/>
+        </w:rPr>
       </w:pPr>
       <w:r>
         <w:t xml:space="preserve">Svi </w:t>
@@ -3996,6 +4274,7 @@
           <w:b/>
           <w:bCs/>
         </w:rPr>
+        <w:lastRenderedPageBreak/>
         <w:t>Slika 13.</w:t>
       </w:r>
       <w:r>
@@ -4110,7 +4389,36 @@
     <w:p>
       <w:pPr>
         <w:spacing w:before="240" w:after="140"/>
-      </w:pPr>
+        <w:rPr>
+          <w:b/>
+          <w:bCs/>
+        </w:rPr>
+      </w:pPr>
+      <w:proofErr w:type="spellStart"/>
+      <w:r>
+        <w:rPr>
+          <w:b/>
+          <w:bCs/>
+        </w:rPr>
+        <w:t>Sortiranje</w:t>
+      </w:r>
+      <w:proofErr w:type="spellEnd"/>
+      <w:r>
+        <w:rPr>
+          <w:b/>
+          <w:bCs/>
+        </w:rPr>
+        <w:t xml:space="preserve"> </w:t>
+      </w:r>
+      <w:proofErr w:type="spellStart"/>
+      <w:r>
+        <w:rPr>
+          <w:b/>
+          <w:bCs/>
+        </w:rPr>
+        <w:t>država</w:t>
+      </w:r>
+      <w:proofErr w:type="spellEnd"/>
     </w:p>
     <w:p>
       <w:pPr>
@@ -4228,13 +4536,8 @@
       <w:r>
         <w:t>.</w:t>
       </w:r>
-    </w:p>
-    <w:p>
-      <w:pPr>
-        <w:spacing w:before="240" w:after="140"/>
-      </w:pPr>
-      <w:r>
-        <w:tab/>
+      <w:r>
+        <w:t xml:space="preserve"> </w:t>
       </w:r>
       <w:proofErr w:type="spellStart"/>
       <w:r>
@@ -4364,6 +4667,9 @@
         <w:jc w:val="center"/>
       </w:pPr>
       <w:r>
+        <w:rPr>
+          <w:noProof/>
+        </w:rPr>
         <w:drawing>
           <wp:inline distT="0" distB="0" distL="0" distR="0" wp14:anchorId="323090BB" wp14:editId="163B20E8">
             <wp:extent cx="5943600" cy="3700780"/>
@@ -4444,9 +4750,88 @@
     </w:p>
     <w:p>
       <w:pPr>
+        <w:tabs>
+          <w:tab w:val="left" w:pos="2498"/>
+        </w:tabs>
         <w:spacing w:before="240" w:after="140"/>
-        <w:jc w:val="center"/>
-      </w:pPr>
+        <w:rPr>
+          <w:b/>
+          <w:bCs/>
+        </w:rPr>
+      </w:pPr>
+      <w:proofErr w:type="spellStart"/>
+      <w:r>
+        <w:rPr>
+          <w:b/>
+          <w:bCs/>
+        </w:rPr>
+        <w:t>Filtriranje</w:t>
+      </w:r>
+      <w:proofErr w:type="spellEnd"/>
+      <w:r>
+        <w:rPr>
+          <w:b/>
+          <w:bCs/>
+        </w:rPr>
+        <w:t xml:space="preserve"> po </w:t>
+      </w:r>
+      <w:proofErr w:type="spellStart"/>
+      <w:r>
+        <w:rPr>
+          <w:b/>
+          <w:bCs/>
+        </w:rPr>
+        <w:t>spolu</w:t>
+      </w:r>
+      <w:proofErr w:type="spellEnd"/>
+      <w:r>
+        <w:rPr>
+          <w:b/>
+          <w:bCs/>
+        </w:rPr>
+        <w:t xml:space="preserve"> </w:t>
+      </w:r>
+      <w:proofErr w:type="spellStart"/>
+      <w:r>
+        <w:rPr>
+          <w:b/>
+          <w:bCs/>
+        </w:rPr>
+        <w:t>i</w:t>
+      </w:r>
+      <w:proofErr w:type="spellEnd"/>
+      <w:r>
+        <w:rPr>
+          <w:b/>
+          <w:bCs/>
+        </w:rPr>
+        <w:t xml:space="preserve"> </w:t>
+      </w:r>
+      <w:proofErr w:type="spellStart"/>
+      <w:r>
+        <w:rPr>
+          <w:b/>
+          <w:bCs/>
+        </w:rPr>
+        <w:t>vrsti</w:t>
+      </w:r>
+      <w:proofErr w:type="spellEnd"/>
+      <w:r>
+        <w:rPr>
+          <w:b/>
+          <w:bCs/>
+        </w:rPr>
+        <w:t xml:space="preserve"> </w:t>
+      </w:r>
+      <w:proofErr w:type="spellStart"/>
+      <w:r>
+        <w:rPr>
+          <w:b/>
+          <w:bCs/>
+        </w:rPr>
+        <w:t>medalje</w:t>
+      </w:r>
+      <w:proofErr w:type="spellEnd"/>
     </w:p>
     <w:p>
       <w:pPr>
@@ -4454,164 +4839,167 @@
       </w:pPr>
       <w:proofErr w:type="spellStart"/>
       <w:r>
+        <w:t>Omogućeno</w:t>
+      </w:r>
+      <w:proofErr w:type="spellEnd"/>
+      <w:r>
+        <w:t xml:space="preserve"> je </w:t>
+      </w:r>
+      <w:proofErr w:type="spellStart"/>
+      <w:r>
+        <w:t>filtriranje</w:t>
+      </w:r>
+      <w:proofErr w:type="spellEnd"/>
+      <w:r>
+        <w:t xml:space="preserve"> </w:t>
+      </w:r>
+      <w:proofErr w:type="spellStart"/>
+      <w:r>
+        <w:t>prikaza</w:t>
+      </w:r>
+      <w:proofErr w:type="spellEnd"/>
+      <w:r>
+        <w:t xml:space="preserve"> </w:t>
+      </w:r>
+      <w:proofErr w:type="spellStart"/>
+      <w:r>
+        <w:t>sportaša</w:t>
+      </w:r>
+      <w:proofErr w:type="spellEnd"/>
+      <w:r>
+        <w:t xml:space="preserve"> </w:t>
+      </w:r>
+      <w:proofErr w:type="spellStart"/>
+      <w:r>
+        <w:t>prema</w:t>
+      </w:r>
+      <w:proofErr w:type="spellEnd"/>
+      <w:r>
+        <w:t xml:space="preserve"> </w:t>
+      </w:r>
+      <w:proofErr w:type="spellStart"/>
+      <w:r>
+        <w:t>spolu</w:t>
+      </w:r>
+      <w:proofErr w:type="spellEnd"/>
+      <w:r>
+        <w:t xml:space="preserve">, a </w:t>
+      </w:r>
+      <w:proofErr w:type="spellStart"/>
+      <w:r>
+        <w:t>kod</w:t>
+      </w:r>
+      <w:proofErr w:type="spellEnd"/>
+      <w:r>
+        <w:t xml:space="preserve"> </w:t>
+      </w:r>
+      <w:proofErr w:type="spellStart"/>
+      <w:r>
+        <w:t>pregleda</w:t>
+      </w:r>
+      <w:proofErr w:type="spellEnd"/>
+      <w:r>
+        <w:t xml:space="preserve"> </w:t>
+      </w:r>
+      <w:proofErr w:type="spellStart"/>
+      <w:r>
+        <w:t>medalja</w:t>
+      </w:r>
+      <w:proofErr w:type="spellEnd"/>
+      <w:r>
+        <w:t xml:space="preserve"> </w:t>
+      </w:r>
+      <w:proofErr w:type="spellStart"/>
+      <w:r>
+        <w:t>moguće</w:t>
+      </w:r>
+      <w:proofErr w:type="spellEnd"/>
+      <w:r>
+        <w:t xml:space="preserve"> je </w:t>
+      </w:r>
+      <w:proofErr w:type="spellStart"/>
+      <w:r>
+        <w:t>prikazivati</w:t>
+      </w:r>
+      <w:proofErr w:type="spellEnd"/>
+      <w:r>
+        <w:t xml:space="preserve"> </w:t>
+      </w:r>
+      <w:proofErr w:type="spellStart"/>
+      <w:r>
+        <w:t>samo</w:t>
+      </w:r>
+      <w:proofErr w:type="spellEnd"/>
+      <w:r>
+        <w:t xml:space="preserve"> one </w:t>
+      </w:r>
+      <w:proofErr w:type="spellStart"/>
+      <w:r>
+        <w:t>koje</w:t>
+      </w:r>
+      <w:proofErr w:type="spellEnd"/>
+      <w:r>
+        <w:t xml:space="preserve"> </w:t>
+      </w:r>
+      <w:proofErr w:type="spellStart"/>
+      <w:r>
+        <w:t>ispunjavaju</w:t>
+      </w:r>
+      <w:proofErr w:type="spellEnd"/>
+      <w:r>
+        <w:t xml:space="preserve"> </w:t>
+      </w:r>
+      <w:proofErr w:type="spellStart"/>
+      <w:r>
+        <w:t>zadane</w:t>
+      </w:r>
+      <w:proofErr w:type="spellEnd"/>
+      <w:r>
+        <w:t xml:space="preserve"> </w:t>
+      </w:r>
+      <w:proofErr w:type="spellStart"/>
+      <w:r>
+        <w:t>kriterije</w:t>
+      </w:r>
+      <w:proofErr w:type="spellEnd"/>
+      <w:r>
+        <w:t>.</w:t>
+      </w:r>
+    </w:p>
+    <w:p>
+      <w:pPr>
+        <w:spacing w:before="240" w:after="140"/>
+      </w:pPr>
+      <w:proofErr w:type="spellStart"/>
+      <w:r>
+        <w:t>Primjer</w:t>
+      </w:r>
+      <w:proofErr w:type="spellEnd"/>
+      <w:r>
+        <w:t xml:space="preserve"> </w:t>
+      </w:r>
+      <w:proofErr w:type="spellStart"/>
+      <w:r>
+        <w:t>koda</w:t>
+      </w:r>
+      <w:proofErr w:type="spellEnd"/>
+      <w:r>
+        <w:t>:</w:t>
+      </w:r>
+    </w:p>
+    <w:p>
+      <w:pPr>
+        <w:spacing w:before="240" w:after="140"/>
+        <w:jc w:val="center"/>
+      </w:pPr>
+      <w:r>
         <w:lastRenderedPageBreak/>
-        <w:t>Omogućeno</w:t>
-      </w:r>
-      <w:proofErr w:type="spellEnd"/>
-      <w:r>
-        <w:t xml:space="preserve"> je </w:t>
-      </w:r>
-      <w:proofErr w:type="spellStart"/>
-      <w:r>
-        <w:t>filtriranje</w:t>
-      </w:r>
-      <w:proofErr w:type="spellEnd"/>
-      <w:r>
-        <w:t xml:space="preserve"> </w:t>
-      </w:r>
-      <w:proofErr w:type="spellStart"/>
-      <w:r>
-        <w:t>prikaza</w:t>
-      </w:r>
-      <w:proofErr w:type="spellEnd"/>
-      <w:r>
-        <w:t xml:space="preserve"> </w:t>
-      </w:r>
-      <w:proofErr w:type="spellStart"/>
-      <w:r>
-        <w:t>sportaša</w:t>
-      </w:r>
-      <w:proofErr w:type="spellEnd"/>
-      <w:r>
-        <w:t xml:space="preserve"> </w:t>
-      </w:r>
-      <w:proofErr w:type="spellStart"/>
-      <w:r>
-        <w:t>prema</w:t>
-      </w:r>
-      <w:proofErr w:type="spellEnd"/>
-      <w:r>
-        <w:t xml:space="preserve"> </w:t>
-      </w:r>
-      <w:proofErr w:type="spellStart"/>
-      <w:r>
-        <w:t>spolu</w:t>
-      </w:r>
-      <w:proofErr w:type="spellEnd"/>
-      <w:r>
-        <w:t xml:space="preserve">, a </w:t>
-      </w:r>
-      <w:proofErr w:type="spellStart"/>
-      <w:r>
-        <w:t>kod</w:t>
-      </w:r>
-      <w:proofErr w:type="spellEnd"/>
-      <w:r>
-        <w:t xml:space="preserve"> </w:t>
-      </w:r>
-      <w:proofErr w:type="spellStart"/>
-      <w:r>
-        <w:t>pregleda</w:t>
-      </w:r>
-      <w:proofErr w:type="spellEnd"/>
-      <w:r>
-        <w:t xml:space="preserve"> </w:t>
-      </w:r>
-      <w:proofErr w:type="spellStart"/>
-      <w:r>
-        <w:t>medalja</w:t>
-      </w:r>
-      <w:proofErr w:type="spellEnd"/>
-      <w:r>
-        <w:t xml:space="preserve"> </w:t>
-      </w:r>
-      <w:proofErr w:type="spellStart"/>
-      <w:r>
-        <w:t>moguće</w:t>
-      </w:r>
-      <w:proofErr w:type="spellEnd"/>
-      <w:r>
-        <w:t xml:space="preserve"> je </w:t>
-      </w:r>
-      <w:proofErr w:type="spellStart"/>
-      <w:r>
-        <w:t>prikazivati</w:t>
-      </w:r>
-      <w:proofErr w:type="spellEnd"/>
-      <w:r>
-        <w:t xml:space="preserve"> </w:t>
-      </w:r>
-      <w:proofErr w:type="spellStart"/>
-      <w:r>
-        <w:t>samo</w:t>
-      </w:r>
-      <w:proofErr w:type="spellEnd"/>
-      <w:r>
-        <w:t xml:space="preserve"> one </w:t>
-      </w:r>
-      <w:proofErr w:type="spellStart"/>
-      <w:r>
-        <w:t>koje</w:t>
-      </w:r>
-      <w:proofErr w:type="spellEnd"/>
-      <w:r>
-        <w:t xml:space="preserve"> </w:t>
-      </w:r>
-      <w:proofErr w:type="spellStart"/>
-      <w:r>
-        <w:t>ispunjavaju</w:t>
-      </w:r>
-      <w:proofErr w:type="spellEnd"/>
-      <w:r>
-        <w:t xml:space="preserve"> </w:t>
-      </w:r>
-      <w:proofErr w:type="spellStart"/>
-      <w:r>
-        <w:t>zadane</w:t>
-      </w:r>
-      <w:proofErr w:type="spellEnd"/>
-      <w:r>
-        <w:t xml:space="preserve"> </w:t>
-      </w:r>
-      <w:proofErr w:type="spellStart"/>
-      <w:r>
-        <w:t>kriterije</w:t>
-      </w:r>
-      <w:proofErr w:type="spellEnd"/>
-      <w:r>
-        <w:t>.</w:t>
-      </w:r>
-    </w:p>
-    <w:p>
-      <w:pPr>
-        <w:spacing w:before="240" w:after="140"/>
-      </w:pPr>
-      <w:proofErr w:type="spellStart"/>
-      <w:r>
-        <w:t>Primjer</w:t>
-      </w:r>
-      <w:proofErr w:type="spellEnd"/>
-      <w:r>
-        <w:t xml:space="preserve"> </w:t>
-      </w:r>
-      <w:proofErr w:type="spellStart"/>
-      <w:r>
-        <w:t>koda</w:t>
-      </w:r>
-      <w:proofErr w:type="spellEnd"/>
-      <w:r>
-        <w:t>:</w:t>
-      </w:r>
-    </w:p>
-    <w:p>
-      <w:pPr>
-        <w:spacing w:before="240" w:after="140"/>
-        <w:jc w:val="center"/>
-      </w:pPr>
-      <w:r>
         <w:br/>
       </w:r>
       <w:r>
+        <w:rPr>
+          <w:noProof/>
+        </w:rPr>
         <w:drawing>
           <wp:inline distT="0" distB="0" distL="0" distR="0" wp14:anchorId="2B11A2BC" wp14:editId="10989A17">
             <wp:extent cx="4617720" cy="6339839"/>
@@ -4733,6 +5121,9 @@
         <w:jc w:val="center"/>
       </w:pPr>
       <w:r>
+        <w:rPr>
+          <w:noProof/>
+        </w:rPr>
         <w:lastRenderedPageBreak/>
         <w:drawing>
           <wp:inline distT="0" distB="0" distL="0" distR="0" wp14:anchorId="7D5511AB" wp14:editId="061F9619">
@@ -4834,9 +5225,18 @@
     </w:p>
     <w:p>
       <w:pPr>
-        <w:jc w:val="center"/>
-      </w:pPr>
-      <w:r>
+        <w:spacing w:before="240" w:after="140"/>
+        <w:jc w:val="center"/>
+      </w:pPr>
+    </w:p>
+    <w:p>
+      <w:pPr>
+        <w:jc w:val="center"/>
+      </w:pPr>
+      <w:r>
+        <w:rPr>
+          <w:noProof/>
+        </w:rPr>
         <w:drawing>
           <wp:inline distT="0" distB="0" distL="0" distR="0" wp14:anchorId="6178499F" wp14:editId="01DF36BA">
             <wp:extent cx="5943600" cy="3027045"/>
@@ -4969,6 +5369,9 @@
         <w:jc w:val="center"/>
       </w:pPr>
       <w:r>
+        <w:rPr>
+          <w:noProof/>
+        </w:rPr>
         <w:lastRenderedPageBreak/>
         <w:drawing>
           <wp:inline distT="0" distB="0" distL="0" distR="0" wp14:anchorId="7526334A" wp14:editId="7C4E767B">
@@ -5082,11 +5485,15 @@
       </w:r>
       <w:proofErr w:type="spellEnd"/>
     </w:p>
-    <w:p>
-      <w:pPr>
-        <w:jc w:val="center"/>
-      </w:pPr>
-      <w:r>
+    <w:bookmarkEnd w:id="6"/>
+    <w:p>
+      <w:pPr>
+        <w:jc w:val="center"/>
+      </w:pPr>
+      <w:r>
+        <w:rPr>
+          <w:noProof/>
+        </w:rPr>
         <w:lastRenderedPageBreak/>
         <w:drawing>
           <wp:inline distT="0" distB="0" distL="0" distR="0" wp14:anchorId="6CBC3C4A" wp14:editId="45290751">
@@ -5192,6 +5599,7 @@
       </w:r>
       <w:proofErr w:type="spellEnd"/>
     </w:p>
+    <w:bookmarkEnd w:id="5"/>
     <w:p/>
     <w:p/>
     <w:p/>
@@ -5209,12 +5617,16 @@
     <w:p/>
     <w:p/>
     <w:p/>
-    <w:p/>
-    <w:p/>
-    <w:p/>
-    <w:p/>
-    <w:p/>
-    <w:p/>
+    <w:p>
+      <w:pPr>
+        <w:tabs>
+          <w:tab w:val="left" w:pos="1920"/>
+        </w:tabs>
+      </w:pPr>
+      <w:r>
+        <w:tab/>
+      </w:r>
+    </w:p>
     <w:sectPr>
       <w:pgSz w:w="12240" w:h="15840"/>
       <w:pgMar w:top="1440" w:right="1440" w:bottom="1440" w:left="1440" w:header="708" w:footer="708" w:gutter="0"/>
@@ -5998,6 +6410,7 @@
   <w:style w:type="character" w:default="1" w:styleId="DefaultParagraphFont">
     <w:name w:val="Default Paragraph Font"/>
     <w:uiPriority w:val="1"/>
+    <w:semiHidden/>
     <w:unhideWhenUsed/>
   </w:style>
   <w:style w:type="table" w:default="1" w:styleId="TableNormal">

</xml_diff>